<commit_message>
correcion de casos de uso
</commit_message>
<xml_diff>
--- a/CU/CU-21.docx
+++ b/CU/CU-21.docx
@@ -10,8 +10,6 @@
         <w:tblInd w:w="0" w:type="dxa"/>
         <w:tblCellMar>
           <w:top w:w="163" w:type="dxa"/>
-          <w:left w:w="0" w:type="dxa"/>
-          <w:bottom w:w="0" w:type="dxa"/>
           <w:right w:w="104" w:type="dxa"/>
         </w:tblCellMar>
         <w:tblLook w:val="04A0" w:firstRow="1" w:lastRow="0" w:firstColumn="1" w:lastColumn="0" w:noHBand="0" w:noVBand="1"/>
@@ -264,7 +262,14 @@
                 <w:sz w:val="22"/>
                 <w:szCs w:val="22"/>
               </w:rPr>
-              <w:t>Usuario administrador</w:t>
+              <w:t>Usuario</w:t>
+            </w:r>
+            <w:r>
+              <w:rPr>
+                <w:sz w:val="22"/>
+                <w:szCs w:val="22"/>
+              </w:rPr>
+              <w:t xml:space="preserve"> administrador u auxiliar</w:t>
             </w:r>
           </w:p>
         </w:tc>
@@ -1038,14 +1043,7 @@
                 <w:sz w:val="22"/>
                 <w:szCs w:val="22"/>
               </w:rPr>
-              <w:t>Evalúa</w:t>
-            </w:r>
-            <w:r>
-              <w:rPr>
-                <w:sz w:val="22"/>
-                <w:szCs w:val="22"/>
-              </w:rPr>
-              <w:t xml:space="preserve"> la situación del cliente</w:t>
+              <w:t>Evalúa la situación del cliente</w:t>
             </w:r>
           </w:p>
           <w:p>
@@ -1523,14 +1521,7 @@
                 <w:sz w:val="22"/>
                 <w:szCs w:val="22"/>
               </w:rPr>
-              <w:t xml:space="preserve">Se </w:t>
-            </w:r>
-            <w:r>
-              <w:rPr>
-                <w:sz w:val="22"/>
-                <w:szCs w:val="22"/>
-              </w:rPr>
-              <w:t>espera que se lleve a cabo una media baja, dependiente de la cantidad de reservas gestionadas diariamente.</w:t>
+              <w:t>Se espera que se lleve a cabo una media baja, dependiente de la cantidad de reservas gestionadas diariamente.</w:t>
             </w:r>
           </w:p>
         </w:tc>
@@ -3311,6 +3302,7 @@
   <w:style w:type="character" w:default="1" w:styleId="DefaultParagraphFont">
     <w:name w:val="Default Paragraph Font"/>
     <w:uiPriority w:val="1"/>
+    <w:semiHidden/>
     <w:unhideWhenUsed/>
   </w:style>
   <w:style w:type="table" w:default="1" w:styleId="TableNormal">

</xml_diff>